<commit_message>
Use upper-half and meaning prompts for garden poem drills.
Only print 上半句 blanks plus 含义写原句; bust PDF open cache so old sheets are not reused.

Co-authored-by: Cursor <cursoragent@cursor.com>
</commit_message>
<xml_diff>
--- a/printables/gardens/U1-garden.docx
+++ b/printables/gardens/U1-garden.docx
@@ -72,7 +72,7 @@
           <w:color w:val="E85D04"/>
           <w:sz w:val="24"/>
         </w:rPr>
-        <w:t>一、补全诗句（给出句，写下句）</w:t>
+        <w:t>一、写出下半句（只给出上半句）</w:t>
       </w:r>
     </w:p>
     <w:p>
@@ -128,7 +128,7 @@
           <w:color w:val="E85D04"/>
           <w:sz w:val="24"/>
         </w:rPr>
-        <w:t>二、根据意思写原句（2题）</w:t>
+        <w:t>二、根据含义写出原句（整句）</w:t>
       </w:r>
     </w:p>
     <w:p>
@@ -142,7 +142,7 @@
           <w:color w:val="1C1917"/>
           <w:sz w:val="22"/>
         </w:rPr>
-        <w:t>1. 意思：空旷的山里看不见人。</w:t>
+        <w:t>1. 意思：只听见有人说话的声音。</w:t>
       </w:r>
     </w:p>
     <w:p>
@@ -170,7 +170,7 @@
           <w:color w:val="1C1917"/>
           <w:sz w:val="22"/>
         </w:rPr>
-        <w:t>2. 意思：只听见有人说话的声音。</w:t>
+        <w:t>2. 意思：又照在青苔上面。</w:t>
       </w:r>
     </w:p>
     <w:p>

</xml_diff>